<commit_message>
[Doc]: bổ sung test report theo main tới #201 — 26 case API mới cho mic phòng ghi từng lượt, xoá lượt, tải bản ghi/bản gỡ băng, nghe lại câu nói, loại câu khỏi bản ghi, câu gửi muộn, giọng mẫu nghe lại và gắn tài liệu vào mục nghị sự; thay 3 case trỏ tới test đã đổi tên/bỏ (cách ghi âm giờ theo hình thức họp); cập nhật case UI ghi âm, lời nói, nội dung họp, ô chọn ngày giờ, Voice ID; thêm SYS-10; sinh lại 6 file Report 5.x (1129 test method)
Co-Authored-By: Claude Opus 5.5 <noreply@anthropic.com>
</commit_message>
<xml_diff>
--- a/docs/08-reports/test-reports/Report5.0_Test_Documentation.docx
+++ b/docs/08-reports/test-reports/Report5.0_Test_Documentation.docx
@@ -390,7 +390,7 @@
           <w:szCs w:val="30"/>
           <w:rtl w:val="0"/>
         </w:rPr>
-        <w:t xml:space="preserve">– Hanoi, 2026-10-29 –</w:t>
+        <w:t xml:space="preserve">– Hanoi, 2026-10-30 –</w:t>
       </w:r>
     </w:p>
     <w:p>
@@ -1922,7 +1922,7 @@
                 <w:szCs w:val="24"/>
                 <w:rtl w:val="0"/>
               </w:rPr>
-              <w:t xml:space="preserve">2026-10-29</w:t>
+              <w:t xml:space="preserve">2026-10-30</w:t>
             </w:r>
             <w:r>
               <w:rPr>
@@ -4364,7 +4364,7 @@
         <w:rPr>
           <w:rtl w:val="0"/>
         </w:rPr>
-        <w:t xml:space="preserve">This plan documents the current TrustCabinet implementation (SEP490-G116), test designs and evidence requirements. The inventory contains 1099 xUnit definitions. Execution status: NotRun=1099. Verified evidence: not supplied.</w:t>
+        <w:t xml:space="preserve">This plan documents the current TrustCabinet implementation (SEP490-G116), test designs and evidence requirements. The inventory contains 1129 xUnit definitions. Execution status: NotRun=1129. Verified evidence: not supplied.</w:t>
       </w:r>
       <w:r>
         <w:rPr>
@@ -18881,7 +18881,7 @@
         </w:rPr>
       </w:r>
       <w:r>
-        <w:t xml:space="preserve">. 448 definitions (654 test cases): NotRun=448. </w:t>
+        <w:t xml:space="preserve">. 447 definitions (653 test cases): NotRun=447. </w:t>
       </w:r>
     </w:p>
     <w:p>
@@ -18999,7 +18999,7 @@
         </w:rPr>
       </w:r>
       <w:r>
-        <w:t xml:space="preserve"> and Report5.2.2_Integration_Test_API_Test.xlsx. 83 functional UI test cases and 453 API test cases; 198 automated infrastructure checks run with dotnet test.</w:t>
+        <w:t xml:space="preserve"> and Report5.2.2_Integration_Test_API_Test.xlsx. 89 functional UI test cases and 479 API test cases; 203 automated infrastructure checks run with dotnet test.</w:t>
       </w:r>
     </w:p>
     <w:p>
@@ -19117,7 +19117,7 @@
         </w:rPr>
       </w:r>
       <w:r>
-        <w:t xml:space="preserve">. 9 definitions / scenarios: NotRun=8, Blocked=1. </w:t>
+        <w:t xml:space="preserve">. 10 definitions / scenarios: NotRun=9, Blocked=1. </w:t>
       </w:r>
     </w:p>
     <w:p>

</xml_diff>